<commit_message>
Full library update: +~83 episodes (transcribe/describe/beautify) + rebuilt site/books/feeds
Ran update-all.py: catalog re-scrape, WhisperX transcription of new episodes
(166 new transcripts across dharma-talks + youtube-talks), Claude descriptions,
83 new beautified articles, regenerated 7 RSS feeds, books (PDF/EPUB), and the
static site (search-index 780 entries, 1149 topics). Deletions are site/ rebuild
churn (renamed pages), no source content removed.

NDT→Satipanya Bhante/Nóirín backport was evaluated and NOT applied: cross-project
title matching proved unreliable (same titles = different recordings, duplicate
catalog entries, NDT internal dupes) — no safe automatable gaps found.

Bundles pre-existing working-tree WIP (chapter docx, book_analysis, etc.).

Co-Authored-By: Claude Opus 4.8 (1M context) <noreply@anthropic.com>
</commit_message>
<xml_diff>
--- a/chapters/gratitude-generosity-and-renunciation/chapter-preprint-refined-heavier.docx
+++ b/chapters/gratitude-generosity-and-renunciation/chapter-preprint-refined-heavier.docx
@@ -136,7 +136,7 @@
           <w:color w:val="888888"/>
           <w:sz w:val="18"/>
         </w:rPr>
-        <w:t>on the theme of  gratitude, generosity and renunciation</w:t>
+        <w:t>on the theme of  sila &amp; ethics / the precepts</w:t>
       </w:r>
     </w:p>
     <w:p>
@@ -721,7 +721,7 @@
           <w:color w:val="888888"/>
           <w:sz w:val="18"/>
         </w:rPr>
-        <w:t>Based on: Gratitude Generosity Renunciation</w:t>
+        <w:t>Based on: Gratitude, Generosity and Renunciation</w:t>
       </w:r>
       <w:r>
         <w:br/>

</xml_diff>